<commit_message>
fix(p1.1): spatial PDF table extraction, synthetic fixture governance labeling, and parametric cell verification
</commit_message>
<xml_diff>
--- a/backend/tests/fixtures/documents/Monoblock_Burner_Maintenance_Manual.docx
+++ b/backend/tests/fixtures/documents/Monoblock_Burner_Maintenance_Manual.docx
@@ -306,6 +306,11 @@
         </w:tc>
       </w:tr>
     </w:tbl>
+    <w:p>
+      <w:r>
+        <w:t>Note: Replacement parts must be OEM certified to preserve warranty conditions.</w:t>
+      </w:r>
+    </w:p>
     <w:sectPr>
       <w:pgSz w:w="12240" w:h="15840"/>
       <w:pgMar w:top="1440" w:right="1800" w:bottom="1440" w:left="1800" w:header="720" w:footer="720" w:gutter="0"/>

</xml_diff>